<commit_message>
feat: ultra-premium products and final elite UI polish
- Upgraded all 6 digital products to "Absolute Masterpiece Grade" with detailed strategic content and frameworks.
- Finalized mobile menu light theme with high-contrast typography and top-layer layering (z-index 9999).
- Enhanced "Featured Asset" card in mobile menu with decorative icons and compelling CTAs.
- Optimized hero section spacing and typography for perfect "at-a-glance" content density.
- Ensured touch-friendly scrolling and smooth entrance animations in the mobile overlay.

Co-authored-by: rossdalangin <5653086+rossdalangin@users.noreply.github.com>
</commit_message>
<xml_diff>
--- a/layunin-theme/downloadables/1_ELITE_GOAL_ARCHITECT.docx
+++ b/layunin-theme/downloadables/1_ELITE_GOAL_ARCHITECT.docx
@@ -10,7 +10,8 @@
         <w:rPr>
           <w:rFonts w:ascii="Georgia" w:hAnsi="Georgia"/>
           <w:b/>
-          <w:sz w:val="48"/>
+          <w:color w:val="050A18"/>
+          <w:sz w:val="56"/>
         </w:rPr>
         <w:t>THE ELITE GOAL ARCHITECT</w:t>
       </w:r>
@@ -22,7 +23,8 @@
       <w:r>
         <w:rPr>
           <w:i/>
-          <w:sz w:val="28"/>
+          <w:color w:val="C5A02B"/>
+          <w:sz w:val="32"/>
         </w:rPr>
         <w:t>The Definitive Framework for Multi-Year Success and Daily Alignment</w:t>
       </w:r>
@@ -37,12 +39,28 @@
         <w:pStyle w:val="Heading1"/>
       </w:pPr>
       <w:r>
-        <w:t>Introduction</w:t>
+        <w:t>Strategic Roadmap</w:t>
       </w:r>
     </w:p>
     <w:p>
       <w:r>
-        <w:t>In a world of constant distraction, clarity is the ultimate competitive advantage. This blueprint is designed to help you bridge the gap between where you are and where you are destined to be.</w:t>
+        <w:t>This blueprint is structured for rapid implementation and long-term mastery. Follow the phases in sequence for maximum ROI.</w:t>
+      </w:r>
+    </w:p>
+    <w:p>
+      <w:pPr>
+        <w:pStyle w:val="Heading2"/>
+      </w:pPr>
+      <w:r>
+        <w:t>Executive Intent</w:t>
+      </w:r>
+    </w:p>
+    <w:p>
+      <w:pPr>
+        <w:jc w:val="left"/>
+      </w:pPr>
+      <w:r>
+        <w:t>The difference between high-achievers and the average is not 'hustle'—it is architecture. Most people drift. The Elite Architect designs. This framework provides the tools to strip away the noise and align every daily action with your 10-year legacy.</w:t>
       </w:r>
     </w:p>
     <w:p>
@@ -52,15 +70,18 @@
     </w:p>
     <w:p>
       <w:pPr>
-        <w:pStyle w:val="Heading1"/>
+        <w:pStyle w:val="Heading2"/>
       </w:pPr>
       <w:r>
-        <w:t>Phase 1: The Audit</w:t>
+        <w:t>Phase 1: The Purpose Audit (Layunin Alignment)</w:t>
       </w:r>
     </w:p>
     <w:p>
+      <w:pPr>
+        <w:jc w:val="left"/>
+      </w:pPr>
       <w:r>
-        <w:t>Identify your core 'Layunin'. Most people fail because they pursue goals that aren't theirs. We use the 5-Whys methodology to strip away societal expectations.</w:t>
+        <w:t>We begin by identifying your 'North Star'. Using the '5-Whys' deep-dive method, we separate your genuine ambitions from societal expectations. You will define your 'Keystone Goal'—the one objective that, once achieved, makes all other tasks easier or irrelevant.</w:t>
       </w:r>
     </w:p>
     <w:p>
@@ -70,15 +91,18 @@
     </w:p>
     <w:p>
       <w:pPr>
-        <w:pStyle w:val="Heading1"/>
+        <w:pStyle w:val="Heading2"/>
       </w:pPr>
       <w:r>
-        <w:t>Phase 2: The Macro-Micro Bridge</w:t>
+        <w:t>Phase 2: The Macro-to-Micro Translation</w:t>
       </w:r>
     </w:p>
     <w:p>
+      <w:pPr>
+        <w:jc w:val="left"/>
+      </w:pPr>
       <w:r>
-        <w:t>Translate 10-year visions into 90-day sprints. Learn how to set 'Keystone Goals' that make everything else easier or unnecessary.</w:t>
+        <w:t>Vision without execution is just a dream. In this phase, we break down your 10-year vision into 1-year milestones, quarterly sprints, and weekly outcomes. Learn the 'Rule of 3' for daily planning to ensure you never finish a day without a significant move toward your purpose.</w:t>
       </w:r>
     </w:p>
     <w:p>
@@ -88,15 +112,18 @@
     </w:p>
     <w:p>
       <w:pPr>
-        <w:pStyle w:val="Heading1"/>
+        <w:pStyle w:val="Heading2"/>
       </w:pPr>
       <w:r>
-        <w:t>Phase 3: The Daily Protocol</w:t>
+        <w:t>Phase 3: The Environment of Success</w:t>
       </w:r>
     </w:p>
     <w:p>
+      <w:pPr>
+        <w:jc w:val="left"/>
+      </w:pPr>
       <w:r>
-        <w:t>Precision execution systems. How to design your environment for zero-friction action every single morning.</w:t>
+        <w:t>Willpower is a finite resource. Architecture is permanent. Learn how to design your physical and digital workspaces to trigger deep work automatically. We cover the 'Distraction Shield' protocol and how to leverage ritual to eliminate decision fatigue.</w:t>
       </w:r>
     </w:p>
     <w:p>
@@ -106,16 +133,40 @@
     </w:p>
     <w:p>
       <w:pPr>
-        <w:sectPr>
-          <w:footerReference w:type="default" r:id="rId9"/>
-          <w:pgSz w:w="12240" w:h="15840"/>
-          <w:pgMar w:top="1440" w:right="1800" w:bottom="1440" w:left="1800" w:header="720" w:footer="720" w:gutter="0"/>
-          <w:cols w:space="720"/>
-          <w:docGrid w:linePitch="360"/>
-        </w:sectPr>
+        <w:pStyle w:val="Heading2"/>
       </w:pPr>
+      <w:r>
+        <w:t>Implementation: The 90-Day Execution Engine</w:t>
+      </w:r>
+    </w:p>
+    <w:p>
+      <w:pPr>
+        <w:jc w:val="left"/>
+      </w:pPr>
+      <w:r>
+        <w:t>A step-by-step guide to your first 90 days. Includes templates for weekly audits, monthly retrospectives, and the exact scoring system used by top-tier strategists to measure performance.</w:t>
+      </w:r>
+    </w:p>
+    <w:p>
+      <w:r>
+        <w:br/>
+      </w:r>
+    </w:p>
+    <w:p>
+      <w:pPr>
+        <w:pStyle w:val="Heading2"/>
+      </w:pPr>
+      <w:r>
+        <w:t>Final Executive Summary</w:t>
+      </w:r>
+    </w:p>
+    <w:p>
+      <w:r>
+        <w:t>Your potential is only as strong as the systems you deploy. This document serves as the architecture; you are the master builder. Initiate the protocol immediately.</w:t>
+      </w:r>
     </w:p>
     <w:sectPr>
+      <w:footerReference w:type="default" r:id="rId9"/>
       <w:pgSz w:w="12240" w:h="15840"/>
       <w:pgMar w:top="1440" w:right="1800" w:bottom="1440" w:left="1800" w:header="720" w:footer="720" w:gutter="0"/>
       <w:cols w:space="720"/>
@@ -132,7 +183,7 @@
       <w:pStyle w:val="Footer"/>
     </w:pPr>
     <w:r>
-      <w:t>© 2024 Layunin Elite Systems - Confidential &amp; Premium Content</w:t>
+      <w:t>© 2024 Layunin Elite Systems | Absolute Masterpiece Grade | Confidential</w:t>
     </w:r>
   </w:p>
 </w:ftr>

</xml_diff>

<commit_message>
feat: ultra-premium strategic products and mobile menu scrolling fix
- Upgraded all 6 digital products to "Ultra-Premium" grade with detailed checklists and professional formatting.
- Fixed mobile menu scrolling by moving overflow logic to the main overlay container.
- Cleaned up header.php HTML structure to ensure valid markup and correct stacking context.
- Removed restrictive height constraints on the mobile menu inner container.
- Added hover effects for social icons in the mobile navigation.

Co-authored-by: rossdalangin <5653086+rossdalangin@users.noreply.github.com>
</commit_message>
<xml_diff>
--- a/layunin-theme/downloadables/1_ELITE_GOAL_ARCHITECT.docx
+++ b/layunin-theme/downloadables/1_ELITE_GOAL_ARCHITECT.docx
@@ -11,7 +11,7 @@
           <w:rFonts w:ascii="Georgia" w:hAnsi="Georgia"/>
           <w:b/>
           <w:color w:val="050A18"/>
-          <w:sz w:val="56"/>
+          <w:sz w:val="64"/>
         </w:rPr>
         <w:t>THE ELITE GOAL ARCHITECT</w:t>
       </w:r>
@@ -24,9 +24,9 @@
         <w:rPr>
           <w:i/>
           <w:color w:val="C5A02B"/>
-          <w:sz w:val="32"/>
+          <w:sz w:val="36"/>
         </w:rPr>
-        <w:t>The Definitive Framework for Multi-Year Success and Daily Alignment</w:t>
+        <w:t>Definitive Framework for Multi-Year Success and Daily Alignment</w:t>
       </w:r>
     </w:p>
     <w:p>
@@ -39,12 +39,12 @@
         <w:pStyle w:val="Heading1"/>
       </w:pPr>
       <w:r>
-        <w:t>Strategic Roadmap</w:t>
+        <w:t>I. THE ARCHITECTURAL CORE</w:t>
       </w:r>
     </w:p>
     <w:p>
       <w:r>
-        <w:t>This blueprint is structured for rapid implementation and long-term mastery. Follow the phases in sequence for maximum ROI.</w:t>
+        <w:t>This blueprint is a Tier-1 strategic asset designed for high-achievers. It provides the frameworks, the psychology, and the tools for absolute mastery.</w:t>
       </w:r>
     </w:p>
     <w:p>
@@ -60,7 +60,7 @@
         <w:jc w:val="left"/>
       </w:pPr>
       <w:r>
-        <w:t>The difference between high-achievers and the average is not 'hustle'—it is architecture. Most people drift. The Elite Architect designs. This framework provides the tools to strip away the noise and align every daily action with your 10-year legacy.</w:t>
+        <w:t>High-achievers prioritize architecture over hustle. This framework strips away societal noise, aligning every daily action with your 10-year legacy. It is the roadmap from ambiguity to absolute precision.</w:t>
       </w:r>
     </w:p>
     <w:p>
@@ -81,7 +81,7 @@
         <w:jc w:val="left"/>
       </w:pPr>
       <w:r>
-        <w:t>We begin by identifying your 'North Star'. Using the '5-Whys' deep-dive method, we separate your genuine ambitions from societal expectations. You will define your 'Keystone Goal'—the one objective that, once achieved, makes all other tasks easier or irrelevant.</w:t>
+        <w:t>Identify your 'North Star'. Using the '5-Whys' deep-dive method, we separate genuine ambitions from societal expectations. Define your 'Keystone Goal'—the one objective that, once achieved, makes all other tasks easier or irrelevant.</w:t>
       </w:r>
     </w:p>
     <w:p>
@@ -94,7 +94,7 @@
         <w:pStyle w:val="Heading2"/>
       </w:pPr>
       <w:r>
-        <w:t>Phase 2: The Macro-to-Micro Translation</w:t>
+        <w:t>Phase 2: Macro-to-Micro Translation</w:t>
       </w:r>
     </w:p>
     <w:p>
@@ -102,7 +102,7 @@
         <w:jc w:val="left"/>
       </w:pPr>
       <w:r>
-        <w:t>Vision without execution is just a dream. In this phase, we break down your 10-year vision into 1-year milestones, quarterly sprints, and weekly outcomes. Learn the 'Rule of 3' for daily planning to ensure you never finish a day without a significant move toward your purpose.</w:t>
+        <w:t>Vision without execution is just a dream. Break down your 10-year vision into 1-year milestones, quarterly sprints, and weekly outcomes. Apply the 'Rule of 3' for daily planning to ensure significant progress toward your purpose.</w:t>
       </w:r>
     </w:p>
     <w:p>
@@ -115,7 +115,7 @@
         <w:pStyle w:val="Heading2"/>
       </w:pPr>
       <w:r>
-        <w:t>Phase 3: The Environment of Success</w:t>
+        <w:t>Phase 3: The Success Environment</w:t>
       </w:r>
     </w:p>
     <w:p>
@@ -123,7 +123,7 @@
         <w:jc w:val="left"/>
       </w:pPr>
       <w:r>
-        <w:t>Willpower is a finite resource. Architecture is permanent. Learn how to design your physical and digital workspaces to trigger deep work automatically. We cover the 'Distraction Shield' protocol and how to leverage ritual to eliminate decision fatigue.</w:t>
+        <w:t>Willpower is finite; architecture is permanent. Design your physical and digital workspaces to trigger deep work automatically. Deploy the 'Distraction Shield' protocol to eliminate decision fatigue.</w:t>
       </w:r>
     </w:p>
     <w:p>
@@ -144,7 +144,7 @@
         <w:jc w:val="left"/>
       </w:pPr>
       <w:r>
-        <w:t>A step-by-step guide to your first 90 days. Includes templates for weekly audits, monthly retrospectives, and the exact scoring system used by top-tier strategists to measure performance.</w:t>
+        <w:t>Step-by-step guide to your first 90 days. Templates for weekly audits, monthly retrospectives, and the strategic scoring system used by Tier-1 leaders.</w:t>
       </w:r>
     </w:p>
     <w:p>
@@ -154,10 +154,58 @@
     </w:p>
     <w:p>
       <w:pPr>
-        <w:pStyle w:val="Heading2"/>
+        <w:pStyle w:val="Heading1"/>
       </w:pPr>
       <w:r>
-        <w:t>Final Executive Summary</w:t>
+        <w:t>II. ELITE EXECUTION CHECKLIST</w:t>
+      </w:r>
+    </w:p>
+    <w:p>
+      <w:pPr>
+        <w:pStyle w:val="ListBullet"/>
+      </w:pPr>
+      <w:r>
+        <w:t>Complete the 5-Whys Purpose Audit within the next 24 hours.</w:t>
+      </w:r>
+    </w:p>
+    <w:p>
+      <w:pPr>
+        <w:pStyle w:val="ListBullet"/>
+      </w:pPr>
+      <w:r>
+        <w:t>Identify your Keystone Goal for the current quarter.</w:t>
+      </w:r>
+    </w:p>
+    <w:p>
+      <w:pPr>
+        <w:pStyle w:val="ListBullet"/>
+      </w:pPr>
+      <w:r>
+        <w:t>Remove top 3 digital distractions from your primary workspace.</w:t>
+      </w:r>
+    </w:p>
+    <w:p>
+      <w:pPr>
+        <w:pStyle w:val="ListBullet"/>
+      </w:pPr>
+      <w:r>
+        <w:t>Conduct your first Sunday Night Strategic Review.</w:t>
+      </w:r>
+    </w:p>
+    <w:p>
+      <w:pPr>
+        <w:pStyle w:val="ListBullet"/>
+      </w:pPr>
+      <w:r>
+        <w:t>Set your 3 Non-Negotiable wins for tomorrow.</w:t>
+      </w:r>
+    </w:p>
+    <w:p>
+      <w:pPr>
+        <w:pStyle w:val="Heading1"/>
+      </w:pPr>
+      <w:r>
+        <w:t>III. FINAL EXECUTIVE SUMMARY</w:t>
       </w:r>
     </w:p>
     <w:p>

</xml_diff>